<commit_message>
Refactor frontend to MVC architecture
</commit_message>
<xml_diff>
--- a/ElectroMap_Report_FINAL_.docx
+++ b/ElectroMap_Report_FINAL_.docx
@@ -5227,228 +5227,18 @@
       <w:r>
         <w:t>The ElectroMap application follows the Model-View-Controller (MVC) architectural pattern, a software design approach that separates an application into three interconnected layers. This separation allows for modularity, easier maintenance, and scalability.</w:t>
       </w:r>
-    </w:p>
-    <w:p>
-      <w:pPr>
-        <w:pStyle w:val="BodyText"/>
-        <w:spacing w:line="276" w:lineRule="auto"/>
-      </w:pPr>
-    </w:p>
-    <w:p>
-      <w:pPr>
-        <w:pStyle w:val="BodyText"/>
-        <w:spacing w:line="276" w:lineRule="auto"/>
-        <w:ind w:firstLine="720"/>
-        <w:rPr>
-          <w:b/>
-          <w:bCs/>
-        </w:rPr>
-      </w:pPr>
-      <w:r>
-        <w:rPr>
-          <w:b/>
-          <w:bCs/>
-        </w:rPr>
-        <w:t>Model Layer (Data Layer)</w:t>
-      </w:r>
-    </w:p>
-    <w:p>
-      <w:pPr>
-        <w:pStyle w:val="BodyText"/>
-        <w:spacing w:line="276" w:lineRule="auto"/>
-        <w:ind w:left="720"/>
-      </w:pPr>
-      <w:r>
-        <w:t>The Model layer is responsible for handling all data-related logic. This includes the definition of data schemas and the operations performed on the database using those schemas. The models are implemented using Mongoose, which provides a schema-based solution to model application data for MongoDB. ElectroMap has models primarily for Users and Stations.</w:t>
-      </w:r>
-    </w:p>
-    <w:p>
-      <w:pPr>
-        <w:pStyle w:val="BodyText"/>
-        <w:spacing w:line="276" w:lineRule="auto"/>
-      </w:pPr>
-    </w:p>
-    <w:p>
-      <w:pPr>
-        <w:pStyle w:val="BodyText"/>
-        <w:spacing w:line="276" w:lineRule="auto"/>
-        <w:ind w:firstLine="720"/>
-        <w:rPr>
-          <w:b/>
-          <w:bCs/>
-        </w:rPr>
-      </w:pPr>
-      <w:r>
-        <w:rPr>
-          <w:b/>
-          <w:bCs/>
-        </w:rPr>
-        <w:t>Controller Layer</w:t>
-      </w:r>
-    </w:p>
-    <w:p>
-      <w:pPr>
-        <w:pStyle w:val="BodyText"/>
-        <w:spacing w:line="276" w:lineRule="auto"/>
-        <w:ind w:left="720"/>
-      </w:pPr>
-      <w:r>
-        <w:t>The Controller layer acts as an intermediary between the routing layer (View) and the models. It receives incoming requests, processes the input (validation, authentication verification), calls the appropriate methods from the model, and returns a JSON response to the client. Controllers are organized by domain, typically covering authentication (auth), station management, and user profiles.</w:t>
-      </w:r>
-    </w:p>
-    <w:p>
-      <w:pPr>
-        <w:pStyle w:val="BodyText"/>
-        <w:spacing w:line="276" w:lineRule="auto"/>
-      </w:pPr>
-    </w:p>
-    <w:p>
-      <w:pPr>
-        <w:pStyle w:val="BodyText"/>
-        <w:spacing w:line="276" w:lineRule="auto"/>
-        <w:ind w:firstLine="720"/>
-        <w:rPr>
-          <w:b/>
-          <w:bCs/>
-        </w:rPr>
-      </w:pPr>
-      <w:r>
-        <w:rPr>
-          <w:b/>
-          <w:bCs/>
-        </w:rPr>
-        <w:t>View Layer (Routing Layer)</w:t>
-      </w:r>
-    </w:p>
-    <w:p>
-      <w:pPr>
-        <w:pStyle w:val="BodyText"/>
-        <w:spacing w:line="276" w:lineRule="auto"/>
-        <w:ind w:left="720"/>
-      </w:pPr>
-      <w:r>
-        <w:t>In the context of this backend REST API, the View is implemented as the routing layer, where various API endpoints are defined. These endpoints determine how the backend responds to different HTTP requests (GET, POST, PUT, DELETE) and are responsible for invoking the appropriate controller functions. The actual visual presentation is handed off to the decoupled React.js frontend.</w:t>
-      </w:r>
-    </w:p>
-    <w:p>
-      <w:pPr>
-        <w:pStyle w:val="BodyText"/>
-        <w:spacing w:line="276" w:lineRule="auto"/>
-      </w:pPr>
-    </w:p>
-    <w:p>
-      <w:pPr>
-        <w:pStyle w:val="BodyText"/>
-        <w:spacing w:line="276" w:lineRule="auto"/>
-        <w:ind w:firstLine="720"/>
-        <w:rPr>
-          <w:b/>
-          <w:bCs/>
-        </w:rPr>
-      </w:pPr>
-      <w:r>
-        <w:rPr>
-          <w:b/>
-          <w:bCs/>
-        </w:rPr>
-        <w:t>Advantages of Using MVC in This Project</w:t>
-      </w:r>
-    </w:p>
-    <w:p>
-      <w:pPr>
-        <w:pStyle w:val="BodyText"/>
-        <w:spacing w:line="276" w:lineRule="auto"/>
-        <w:ind w:left="720"/>
-      </w:pPr>
-      <w:r>
-        <w:t>• Separation of Concerns: By isolating data logic (Model), request handling (Controller), and routing (View), the codebase remains clean, organized, and prevents spaghetti code.</w:t>
-      </w:r>
-    </w:p>
-    <w:p>
-      <w:pPr>
-        <w:pStyle w:val="BodyText"/>
-        <w:spacing w:line="276" w:lineRule="auto"/>
-        <w:ind w:left="720"/>
-      </w:pPr>
-    </w:p>
-    <w:p>
-      <w:pPr>
-        <w:pStyle w:val="BodyText"/>
-        <w:spacing w:line="276" w:lineRule="auto"/>
-        <w:ind w:left="720"/>
-      </w:pPr>
-      <w:r>
-        <w:t>• Modularity and Scalability: Different parts of the application can be developed and updated independently. For example, the database schema (Model) can be modified without breaking the routing structure (View).</w:t>
-      </w:r>
-    </w:p>
-    <w:p>
-      <w:pPr>
-        <w:pStyle w:val="BodyText"/>
-        <w:spacing w:line="276" w:lineRule="auto"/>
-        <w:ind w:left="720"/>
-      </w:pPr>
-    </w:p>
-    <w:p>
-      <w:pPr>
-        <w:pStyle w:val="BodyText"/>
-        <w:spacing w:line="276" w:lineRule="auto"/>
-        <w:ind w:left="720"/>
-      </w:pPr>
-      <w:r>
-        <w:t>• Easier Debugging and Maintenance: When an issue arises, the MVC structure makes it easier to pinpoint whether it is a data-related bug, a logic error in the controller, or a routing mistake.</w:t>
-      </w:r>
-    </w:p>
-    <w:p>
-      <w:pPr>
-        <w:pStyle w:val="BodyText"/>
-        <w:spacing w:line="276" w:lineRule="auto"/>
-        <w:ind w:left="720"/>
-      </w:pPr>
-    </w:p>
-    <w:p>
-      <w:pPr>
-        <w:pStyle w:val="BodyText"/>
-        <w:spacing w:line="276" w:lineRule="auto"/>
-        <w:ind w:left="720"/>
-        <w:sectPr>
-          <w:pgSz w:w="11910" w:h="16840"/>
-          <w:pgMar w:top="1360" w:right="708" w:bottom="280" w:left="708" w:header="720" w:footer="720" w:gutter="0"/>
-          <w:pgBorders w:offsetFrom="page">
-            <w:top w:val="single" w:sz="4" w:space="24" w:color="000000"/>
-            <w:left w:val="single" w:sz="4" w:space="24" w:color="000000"/>
-            <w:bottom w:val="single" w:sz="4" w:space="24" w:color="000000"/>
-            <w:right w:val="single" w:sz="4" w:space="24" w:color="000000"/>
-          </w:pgBorders>
-          <w:cols w:space="720"/>
-        </w:sectPr>
-      </w:pPr>
-      <w:r>
-        <w:t>• Parallel Development: The backend team can work on API controllers and models while the frontend team simultaneously builds the React UI based on the defined API endpoints.</w:t>
-      </w:r>
-    </w:p>
-    <w:p>
-      <w:pPr>
-        <w:pStyle w:val="BodyText"/>
-        <w:spacing w:before="171"/>
-        <w:rPr>
-          <w:sz w:val="20"/>
-        </w:rPr>
-      </w:pPr>
-    </w:p>
-    <w:p>
-      <w:pPr>
-        <w:pStyle w:val="BodyText"/>
-        <w:ind w:left="1040"/>
-        <w:rPr>
-          <w:sz w:val="20"/>
-        </w:rPr>
-      </w:pPr>
       <w:r>
         <w:rPr>
           <w:noProof/>
         </w:rPr>
+        <w:t xml:space="preserve"> </w:t>
+      </w:r>
+      <w:r>
+        <w:rPr>
+          <w:noProof/>
+        </w:rPr>
         <w:drawing>
-          <wp:inline distT="0" distB="0" distL="0" distR="0" wp14:anchorId="2815AE63" wp14:editId="0DA4D980">
+          <wp:inline distT="0" distB="0" distL="0" distR="0" wp14:anchorId="6F218B2B" wp14:editId="74E4E668">
             <wp:extent cx="5848350" cy="3898900"/>
             <wp:effectExtent l="0" t="0" r="0" b="6350"/>
             <wp:docPr id="116057973" name="Picture 5"/>
@@ -5500,6 +5290,212 @@
     <w:p>
       <w:pPr>
         <w:pStyle w:val="BodyText"/>
+        <w:spacing w:line="276" w:lineRule="auto"/>
+      </w:pPr>
+    </w:p>
+    <w:p>
+      <w:pPr>
+        <w:pStyle w:val="BodyText"/>
+        <w:spacing w:line="276" w:lineRule="auto"/>
+        <w:ind w:firstLine="720"/>
+        <w:rPr>
+          <w:b/>
+          <w:bCs/>
+        </w:rPr>
+      </w:pPr>
+      <w:r>
+        <w:rPr>
+          <w:b/>
+          <w:bCs/>
+        </w:rPr>
+        <w:t>Model Layer (Data Layer)</w:t>
+      </w:r>
+    </w:p>
+    <w:p>
+      <w:pPr>
+        <w:pStyle w:val="BodyText"/>
+        <w:spacing w:line="276" w:lineRule="auto"/>
+        <w:ind w:left="720"/>
+      </w:pPr>
+      <w:r>
+        <w:t>The Model layer is responsible for handling all data-related logic. This includes the definition of data schemas and the operations performed on the database using those schemas. The models are implemented using Mongoose, which provides a schema-based solution to model application data for MongoDB. ElectroMap has models primarily for Users and Stations.</w:t>
+      </w:r>
+    </w:p>
+    <w:p>
+      <w:pPr>
+        <w:pStyle w:val="BodyText"/>
+        <w:spacing w:line="276" w:lineRule="auto"/>
+      </w:pPr>
+    </w:p>
+    <w:p>
+      <w:pPr>
+        <w:pStyle w:val="BodyText"/>
+        <w:spacing w:line="276" w:lineRule="auto"/>
+        <w:ind w:firstLine="720"/>
+        <w:rPr>
+          <w:b/>
+          <w:bCs/>
+        </w:rPr>
+      </w:pPr>
+      <w:r>
+        <w:rPr>
+          <w:b/>
+          <w:bCs/>
+        </w:rPr>
+        <w:t>Controller Layer</w:t>
+      </w:r>
+    </w:p>
+    <w:p>
+      <w:pPr>
+        <w:pStyle w:val="BodyText"/>
+        <w:spacing w:line="276" w:lineRule="auto"/>
+        <w:ind w:left="720"/>
+      </w:pPr>
+      <w:r>
+        <w:t>The Controller layer acts as an intermediary between the routing layer (View) and the models. It receives incoming requests, processes the input (validation, authentication verification), calls the appropriate methods from the model, and returns a JSON response to the client. Controllers are organized by domain, typically covering authentication (auth), station management, and user profiles.</w:t>
+      </w:r>
+    </w:p>
+    <w:p>
+      <w:pPr>
+        <w:pStyle w:val="BodyText"/>
+        <w:spacing w:line="276" w:lineRule="auto"/>
+      </w:pPr>
+    </w:p>
+    <w:p>
+      <w:pPr>
+        <w:pStyle w:val="BodyText"/>
+        <w:spacing w:line="276" w:lineRule="auto"/>
+        <w:ind w:firstLine="720"/>
+        <w:rPr>
+          <w:b/>
+          <w:bCs/>
+        </w:rPr>
+      </w:pPr>
+      <w:r>
+        <w:rPr>
+          <w:b/>
+          <w:bCs/>
+        </w:rPr>
+        <w:t>View Layer (Routing Layer)</w:t>
+      </w:r>
+    </w:p>
+    <w:p>
+      <w:pPr>
+        <w:pStyle w:val="BodyText"/>
+        <w:spacing w:line="276" w:lineRule="auto"/>
+        <w:ind w:left="720"/>
+      </w:pPr>
+      <w:r>
+        <w:t>In the context of this backend REST API, the View is implemented as the routing layer, where various API endpoints are defined. These endpoints determine how the backend responds to different HTTP requests (GET, POST, PUT, DELETE) and are responsible for invoking the appropriate controller functions. The actual visual presentation is handed off to the decoupled React.js frontend.</w:t>
+      </w:r>
+    </w:p>
+    <w:p>
+      <w:pPr>
+        <w:pStyle w:val="BodyText"/>
+        <w:spacing w:line="276" w:lineRule="auto"/>
+      </w:pPr>
+    </w:p>
+    <w:p>
+      <w:pPr>
+        <w:pStyle w:val="BodyText"/>
+        <w:spacing w:line="276" w:lineRule="auto"/>
+        <w:ind w:firstLine="720"/>
+        <w:rPr>
+          <w:b/>
+          <w:bCs/>
+        </w:rPr>
+      </w:pPr>
+      <w:r>
+        <w:rPr>
+          <w:b/>
+          <w:bCs/>
+        </w:rPr>
+        <w:lastRenderedPageBreak/>
+        <w:t>Advantages of Using MVC in This Project</w:t>
+      </w:r>
+    </w:p>
+    <w:p>
+      <w:pPr>
+        <w:pStyle w:val="BodyText"/>
+        <w:spacing w:line="276" w:lineRule="auto"/>
+        <w:ind w:left="720"/>
+      </w:pPr>
+      <w:r>
+        <w:t>• Separation of Concerns: By isolating data logic (Model), request handling (Controller), and routing (View), the codebase remains clean, organized, and prevents spaghetti code.</w:t>
+      </w:r>
+    </w:p>
+    <w:p>
+      <w:pPr>
+        <w:pStyle w:val="BodyText"/>
+        <w:spacing w:line="276" w:lineRule="auto"/>
+        <w:ind w:left="720"/>
+      </w:pPr>
+    </w:p>
+    <w:p>
+      <w:pPr>
+        <w:pStyle w:val="BodyText"/>
+        <w:spacing w:line="276" w:lineRule="auto"/>
+        <w:ind w:left="720"/>
+      </w:pPr>
+      <w:r>
+        <w:t>• Modularity and Scalability: Different parts of the application can be developed and updated independently. For example, the database schema (Model) can be modified without breaking the routing structure (View).</w:t>
+      </w:r>
+    </w:p>
+    <w:p>
+      <w:pPr>
+        <w:pStyle w:val="BodyText"/>
+        <w:spacing w:line="276" w:lineRule="auto"/>
+        <w:ind w:left="720"/>
+      </w:pPr>
+    </w:p>
+    <w:p>
+      <w:pPr>
+        <w:pStyle w:val="BodyText"/>
+        <w:spacing w:line="276" w:lineRule="auto"/>
+        <w:ind w:left="720"/>
+      </w:pPr>
+      <w:r>
+        <w:t>• Easier Debugging and Maintenance: When an issue arises, the MVC structure makes it easier to pinpoint whether it is a data-related bug, a logic error in the controller, or a routing mistake.</w:t>
+      </w:r>
+    </w:p>
+    <w:p>
+      <w:pPr>
+        <w:pStyle w:val="BodyText"/>
+        <w:spacing w:line="276" w:lineRule="auto"/>
+        <w:ind w:left="720"/>
+      </w:pPr>
+    </w:p>
+    <w:p>
+      <w:pPr>
+        <w:pStyle w:val="BodyText"/>
+        <w:spacing w:line="276" w:lineRule="auto"/>
+        <w:ind w:left="720"/>
+        <w:rPr>
+          <w:sz w:val="20"/>
+        </w:rPr>
+      </w:pPr>
+      <w:r>
+        <w:t>• Parallel Development: The backend team can work on API controllers and models while the frontend team simultaneously builds the React UI based on the defined API endpoints.</w:t>
+      </w:r>
+      <w:r>
+        <w:rPr>
+          <w:sz w:val="20"/>
+        </w:rPr>
+        <w:t xml:space="preserve"> </w:t>
+      </w:r>
+    </w:p>
+    <w:p>
+      <w:pPr>
+        <w:pStyle w:val="BodyText"/>
+        <w:ind w:left="1040"/>
+        <w:rPr>
+          <w:sz w:val="20"/>
+        </w:rPr>
+      </w:pPr>
+    </w:p>
+    <w:p>
+      <w:pPr>
+        <w:pStyle w:val="BodyText"/>
         <w:rPr>
           <w:sz w:val="20"/>
         </w:rPr>
@@ -5955,7 +5951,6 @@
           <w:sz w:val="24"/>
           <w:szCs w:val="24"/>
         </w:rPr>
-        <w:lastRenderedPageBreak/>
         <w:t>◦ Install additional frontend dependencies (Tailwind, Map Libraries, Icons, Routing, etc.):</w:t>
       </w:r>
     </w:p>
@@ -6047,6 +6042,7 @@
           <w:sz w:val="24"/>
           <w:szCs w:val="24"/>
         </w:rPr>
+        <w:lastRenderedPageBreak/>
         <w:t>Server setup</w:t>
       </w:r>
     </w:p>
@@ -11414,15 +11410,18 @@
     <w:p>
       <w:pPr>
         <w:pStyle w:val="Heading2"/>
+        <w:numPr>
+          <w:ilvl w:val="0"/>
+          <w:numId w:val="25"/>
+        </w:numPr>
         <w:tabs>
           <w:tab w:val="left" w:pos="1209"/>
         </w:tabs>
         <w:spacing w:before="65"/>
-        <w:ind w:left="0"/>
       </w:pPr>
       <w:r>
         <w:lastRenderedPageBreak/>
-        <w:t xml:space="preserve">   11.OUTPUT</w:t>
+        <w:t>OUTPUT</w:t>
       </w:r>
       <w:r>
         <w:rPr>
@@ -12672,7 +12671,7 @@
         </w:rPr>
         <w:lastRenderedPageBreak/>
         <w:drawing>
-          <wp:anchor distT="0" distB="0" distL="114300" distR="114300" simplePos="0" relativeHeight="251665408" behindDoc="0" locked="0" layoutInCell="1" allowOverlap="1" wp14:anchorId="7D47F4F4" wp14:editId="4DD69BF5">
+          <wp:anchor distT="0" distB="0" distL="114300" distR="114300" simplePos="0" relativeHeight="251665408" behindDoc="0" locked="0" layoutInCell="1" allowOverlap="1" wp14:anchorId="7D47F4F4" wp14:editId="180EC136">
             <wp:simplePos x="0" y="0"/>
             <wp:positionH relativeFrom="column">
               <wp:posOffset>-15240</wp:posOffset>
@@ -12911,61 +12910,19 @@
     </w:p>
     <w:p>
       <w:pPr>
-        <w:pStyle w:val="BodyText"/>
-        <w:rPr>
-          <w:sz w:val="20"/>
-        </w:rPr>
-        <w:sectPr>
-          <w:pgSz w:w="11910" w:h="16840"/>
-          <w:pgMar w:top="1360" w:right="708" w:bottom="280" w:left="708" w:header="720" w:footer="720" w:gutter="0"/>
-          <w:pgBorders w:offsetFrom="page">
-            <w:top w:val="single" w:sz="4" w:space="24" w:color="000000"/>
-            <w:left w:val="single" w:sz="4" w:space="24" w:color="000000"/>
-            <w:bottom w:val="single" w:sz="4" w:space="24" w:color="000000"/>
-            <w:right w:val="single" w:sz="4" w:space="24" w:color="000000"/>
-          </w:pgBorders>
-          <w:cols w:space="720"/>
-        </w:sectPr>
-      </w:pPr>
-    </w:p>
-    <w:p>
-      <w:pPr>
-        <w:pStyle w:val="BodyText"/>
-        <w:tabs>
-          <w:tab w:val="center" w:pos="5247"/>
-        </w:tabs>
-        <w:rPr>
-          <w:rFonts w:ascii="Arial MT"/>
-          <w:sz w:val="20"/>
-        </w:rPr>
-        <w:sectPr>
-          <w:pgSz w:w="11910" w:h="16840"/>
-          <w:pgMar w:top="1740" w:right="708" w:bottom="280" w:left="708" w:header="720" w:footer="720" w:gutter="0"/>
-          <w:pgBorders w:offsetFrom="page">
-            <w:top w:val="single" w:sz="4" w:space="24" w:color="000000"/>
-            <w:left w:val="single" w:sz="4" w:space="24" w:color="000000"/>
-            <w:bottom w:val="single" w:sz="4" w:space="24" w:color="000000"/>
-            <w:right w:val="single" w:sz="4" w:space="24" w:color="000000"/>
-          </w:pgBorders>
-          <w:cols w:space="720"/>
-        </w:sectPr>
-      </w:pPr>
-    </w:p>
-    <w:p>
-      <w:pPr>
         <w:pStyle w:val="Heading2"/>
         <w:tabs>
           <w:tab w:val="left" w:pos="1135"/>
         </w:tabs>
         <w:spacing w:before="65"/>
-        <w:ind w:left="0"/>
+        <w:ind w:left="720"/>
         <w:rPr>
           <w:sz w:val="26"/>
         </w:rPr>
       </w:pPr>
       <w:r>
         <w:lastRenderedPageBreak/>
-        <w:t xml:space="preserve">        11.</w:t>
+        <w:t xml:space="preserve">13. </w:t>
       </w:r>
       <w:r>
         <w:t>Learning</w:t>
@@ -13338,344 +13295,342 @@
     <w:p>
       <w:pPr>
         <w:pStyle w:val="Heading2"/>
+        <w:tabs>
+          <w:tab w:val="left" w:pos="1209"/>
+        </w:tabs>
+        <w:spacing w:before="65"/>
+        <w:ind w:left="720"/>
+        <w:jc w:val="both"/>
+        <w:rPr>
+          <w:spacing w:val="-2"/>
+        </w:rPr>
+      </w:pPr>
+      <w:r>
+        <w:lastRenderedPageBreak/>
+        <w:t xml:space="preserve">14. </w:t>
+      </w:r>
+      <w:r>
+        <w:t>Future</w:t>
+      </w:r>
+      <w:r>
+        <w:rPr>
+          <w:spacing w:val="-11"/>
+        </w:rPr>
+        <w:t xml:space="preserve"> </w:t>
+      </w:r>
+      <w:r>
+        <w:rPr>
+          <w:spacing w:val="-2"/>
+        </w:rPr>
+        <w:t>Enhancement</w:t>
+      </w:r>
+    </w:p>
+    <w:p>
+      <w:pPr>
+        <w:pStyle w:val="BodyText"/>
+      </w:pPr>
+    </w:p>
+    <w:p>
+      <w:pPr>
+        <w:pStyle w:val="BodyText"/>
+        <w:ind w:left="720"/>
+        <w:rPr>
+          <w:sz w:val="28"/>
+          <w:szCs w:val="28"/>
+        </w:rPr>
+      </w:pPr>
+      <w:r>
+        <w:rPr>
+          <w:sz w:val="28"/>
+          <w:szCs w:val="28"/>
+        </w:rPr>
+        <w:t>1. Live Hardware Integration (OCPP) :Integrate with industry-standard Open Charge Point Protocol (OCPP) APIs to pull true, real-time availability and status updates directly from the physical charging hardware, replacing static database statuses.</w:t>
+      </w:r>
+    </w:p>
+    <w:p>
+      <w:pPr>
+        <w:pStyle w:val="BodyText"/>
+        <w:rPr>
+          <w:sz w:val="28"/>
+          <w:szCs w:val="28"/>
+        </w:rPr>
+      </w:pPr>
+    </w:p>
+    <w:p>
+      <w:pPr>
+        <w:pStyle w:val="BodyText"/>
+        <w:ind w:left="720"/>
+        <w:rPr>
+          <w:sz w:val="28"/>
+          <w:szCs w:val="28"/>
+        </w:rPr>
+      </w:pPr>
+      <w:r>
+        <w:rPr>
+          <w:sz w:val="28"/>
+          <w:szCs w:val="28"/>
+        </w:rPr>
+        <w:t>2. Intelligent Route Planning: Implement advanced routing engines (like Mapbox or Google Directions API) to allow users to plan long road trips, with the system automatically suggesting optimal charging stops based on their specific EV's battery range.</w:t>
+      </w:r>
+    </w:p>
+    <w:p>
+      <w:pPr>
+        <w:pStyle w:val="BodyText"/>
+        <w:ind w:left="720"/>
+        <w:rPr>
+          <w:sz w:val="28"/>
+          <w:szCs w:val="28"/>
+        </w:rPr>
+      </w:pPr>
+    </w:p>
+    <w:p>
+      <w:pPr>
+        <w:pStyle w:val="BodyText"/>
+        <w:ind w:left="720"/>
+        <w:rPr>
+          <w:sz w:val="28"/>
+          <w:szCs w:val="28"/>
+        </w:rPr>
+      </w:pPr>
+      <w:r>
+        <w:rPr>
+          <w:sz w:val="28"/>
+          <w:szCs w:val="28"/>
+        </w:rPr>
+        <w:t>3. In-App Payment Gateway: Integrate payment processors like Stripe or Razorpay to allow users to securely reserve charging slots and pay for their charging sessions directly within the ElectroMap application.</w:t>
+      </w:r>
+    </w:p>
+    <w:p>
+      <w:pPr>
+        <w:pStyle w:val="BodyText"/>
+        <w:ind w:left="720"/>
+        <w:rPr>
+          <w:sz w:val="28"/>
+          <w:szCs w:val="28"/>
+        </w:rPr>
+      </w:pPr>
+    </w:p>
+    <w:p>
+      <w:pPr>
+        <w:pStyle w:val="BodyText"/>
+        <w:ind w:left="720"/>
+        <w:rPr>
+          <w:sz w:val="28"/>
+          <w:szCs w:val="28"/>
+        </w:rPr>
+      </w:pPr>
+      <w:r>
+        <w:rPr>
+          <w:sz w:val="28"/>
+          <w:szCs w:val="28"/>
+        </w:rPr>
+        <w:t>4. User Reviews &amp; Ratings: Allow drivers to leave star ratings, written reviews, and upload photos for charging stations. This crowdsourced feedback helps the community identify broken, blocked, or highly reliable chargers.</w:t>
+      </w:r>
+    </w:p>
+    <w:p>
+      <w:pPr>
+        <w:pStyle w:val="BodyText"/>
+        <w:ind w:left="720"/>
+        <w:rPr>
+          <w:sz w:val="28"/>
+          <w:szCs w:val="28"/>
+        </w:rPr>
+      </w:pPr>
+    </w:p>
+    <w:p>
+      <w:pPr>
+        <w:pStyle w:val="BodyText"/>
+        <w:ind w:left="720"/>
+        <w:rPr>
+          <w:sz w:val="28"/>
+          <w:szCs w:val="28"/>
+        </w:rPr>
+      </w:pPr>
+      <w:r>
+        <w:rPr>
+          <w:sz w:val="28"/>
+          <w:szCs w:val="28"/>
+        </w:rPr>
+        <w:t>5. Vehicle Profile Filtering: Enable users to save their specific EV make and model in their profile. The application can then automatically filter the map to only show stations with compatible connector types (e.g., CCS2, CHAdeMO) and optimal charging speeds.</w:t>
+      </w:r>
+    </w:p>
+    <w:p>
+      <w:pPr>
+        <w:pStyle w:val="BodyText"/>
+        <w:ind w:left="720"/>
+        <w:rPr>
+          <w:sz w:val="28"/>
+          <w:szCs w:val="28"/>
+        </w:rPr>
+      </w:pPr>
+    </w:p>
+    <w:p>
+      <w:pPr>
+        <w:pStyle w:val="BodyText"/>
+        <w:ind w:left="720"/>
+        <w:rPr>
+          <w:sz w:val="28"/>
+          <w:szCs w:val="28"/>
+        </w:rPr>
+      </w:pPr>
+      <w:r>
+        <w:rPr>
+          <w:sz w:val="28"/>
+          <w:szCs w:val="28"/>
+        </w:rPr>
+        <w:t>6. Push Notifications &amp; Alerts: Implement browser or mobile push notifications to alert users when a highly contested nearby station becomes available, or when their ongoing charging session reaches 100%.</w:t>
+      </w:r>
+    </w:p>
+    <w:p>
+      <w:pPr>
+        <w:pStyle w:val="BodyText"/>
+        <w:ind w:left="720"/>
+        <w:rPr>
+          <w:sz w:val="28"/>
+          <w:szCs w:val="28"/>
+        </w:rPr>
+      </w:pPr>
+    </w:p>
+    <w:p>
+      <w:pPr>
+        <w:pStyle w:val="BodyText"/>
+        <w:ind w:left="720"/>
+        <w:rPr>
+          <w:sz w:val="28"/>
+          <w:szCs w:val="28"/>
+        </w:rPr>
+      </w:pPr>
+      <w:r>
+        <w:rPr>
+          <w:sz w:val="28"/>
+          <w:szCs w:val="28"/>
+        </w:rPr>
+        <w:t>7. Advanced Admin Analytics Dashboard: Upgrade the admin panel with visual data representations (using Chart.js or Recharts) showing peak charging hours, the most utilized geographic zones, and user growth trends.</w:t>
+      </w:r>
+    </w:p>
+    <w:p>
+      <w:pPr>
+        <w:pStyle w:val="BodyText"/>
+        <w:ind w:left="720"/>
+        <w:rPr>
+          <w:sz w:val="28"/>
+          <w:szCs w:val="28"/>
+        </w:rPr>
+      </w:pPr>
+    </w:p>
+    <w:p>
+      <w:pPr>
+        <w:pStyle w:val="BodyText"/>
+        <w:ind w:left="720"/>
+        <w:rPr>
+          <w:sz w:val="28"/>
+          <w:szCs w:val="28"/>
+        </w:rPr>
+      </w:pPr>
+      <w:r>
+        <w:rPr>
+          <w:sz w:val="28"/>
+          <w:szCs w:val="28"/>
+        </w:rPr>
+        <w:t>8. Favorite &amp; Saved Stations: Introduce a feature allowing users to bookmark or "favorite" their most frequently visited charging stations for quick access directly from their profile dashboard.</w:t>
+      </w:r>
+    </w:p>
+    <w:p>
+      <w:pPr>
+        <w:pStyle w:val="BodyText"/>
+        <w:ind w:left="720"/>
+        <w:rPr>
+          <w:sz w:val="28"/>
+          <w:szCs w:val="28"/>
+        </w:rPr>
+      </w:pPr>
+    </w:p>
+    <w:p>
+      <w:pPr>
+        <w:pStyle w:val="BodyText"/>
+        <w:ind w:left="720"/>
+        <w:rPr>
+          <w:sz w:val="28"/>
+          <w:szCs w:val="28"/>
+        </w:rPr>
+      </w:pPr>
+      <w:r>
+        <w:rPr>
+          <w:sz w:val="28"/>
+          <w:szCs w:val="28"/>
+        </w:rPr>
+        <w:t>9. Crowdsourced Station Reporting: Allow active users to submit new, undocumented charging stations or flag inaccurate data (e.g., incorrect pricing or closed stations), creating a moderation queue for admins to review and approve.</w:t>
+      </w:r>
+    </w:p>
+    <w:p>
+      <w:pPr>
+        <w:pStyle w:val="BodyText"/>
+        <w:ind w:left="720"/>
+        <w:rPr>
+          <w:sz w:val="28"/>
+          <w:szCs w:val="28"/>
+        </w:rPr>
+      </w:pPr>
+    </w:p>
+    <w:p>
+      <w:pPr>
+        <w:pStyle w:val="BodyText"/>
+        <w:ind w:left="720"/>
+        <w:rPr>
+          <w:sz w:val="28"/>
+          <w:szCs w:val="28"/>
+        </w:rPr>
+      </w:pPr>
+      <w:r>
+        <w:rPr>
+          <w:sz w:val="28"/>
+          <w:szCs w:val="28"/>
+        </w:rPr>
+        <w:t>10.</w:t>
+      </w:r>
+      <w:r>
+        <w:rPr>
+          <w:sz w:val="28"/>
+          <w:szCs w:val="28"/>
+        </w:rPr>
+        <w:t xml:space="preserve"> </w:t>
+      </w:r>
+      <w:r>
+        <w:rPr>
+          <w:sz w:val="28"/>
+          <w:szCs w:val="28"/>
+        </w:rPr>
+        <w:t>Native Navigation Hand-off: Add a "Get Directions" feature that seamlessly exports the selected charging station's precise geospatial coordinates into the user's native Google Maps, Apple Maps, or Waze application for turn-by-turn navigation.</w:t>
+      </w:r>
+    </w:p>
+    <w:p>
+      <w:pPr>
+        <w:rPr>
+          <w:spacing w:val="-2"/>
+          <w:sz w:val="24"/>
+          <w:szCs w:val="24"/>
+        </w:rPr>
+      </w:pPr>
+      <w:r>
+        <w:rPr>
+          <w:spacing w:val="-2"/>
+          <w:sz w:val="24"/>
+          <w:szCs w:val="24"/>
+        </w:rPr>
+        <w:br w:type="page"/>
+      </w:r>
+    </w:p>
+    <w:p>
+      <w:pPr>
+        <w:pStyle w:val="Heading2"/>
         <w:numPr>
-          <w:ilvl w:val="0"/>
-          <w:numId w:val="12"/>
+          <w:ilvl w:val="1"/>
+          <w:numId w:val="22"/>
         </w:numPr>
         <w:tabs>
           <w:tab w:val="left" w:pos="1209"/>
         </w:tabs>
         <w:spacing w:before="65"/>
-        <w:ind w:left="1209" w:hanging="477"/>
-        <w:jc w:val="both"/>
-        <w:rPr>
-          <w:spacing w:val="-2"/>
-        </w:rPr>
-      </w:pPr>
-      <w:r>
-        <w:lastRenderedPageBreak/>
-        <w:t>Future</w:t>
-      </w:r>
-      <w:r>
-        <w:rPr>
-          <w:spacing w:val="-11"/>
-        </w:rPr>
-        <w:t xml:space="preserve"> </w:t>
-      </w:r>
-      <w:r>
-        <w:rPr>
-          <w:spacing w:val="-2"/>
-        </w:rPr>
-        <w:t>Enhancement</w:t>
-      </w:r>
-    </w:p>
-    <w:p>
-      <w:pPr>
-        <w:pStyle w:val="BodyText"/>
-      </w:pPr>
-    </w:p>
-    <w:p>
-      <w:pPr>
-        <w:pStyle w:val="BodyText"/>
-        <w:ind w:left="720"/>
-        <w:rPr>
-          <w:sz w:val="28"/>
-          <w:szCs w:val="28"/>
-        </w:rPr>
-      </w:pPr>
-      <w:r>
-        <w:rPr>
-          <w:sz w:val="28"/>
-          <w:szCs w:val="28"/>
-        </w:rPr>
-        <w:t>1. Live Hardware Integration (OCPP) :Integrate with industry-standard Open Charge Point Protocol (OCPP) APIs to pull true, real-time availability and status updates directly from the physical charging hardware, replacing static database statuses.</w:t>
-      </w:r>
-    </w:p>
-    <w:p>
-      <w:pPr>
-        <w:pStyle w:val="BodyText"/>
-        <w:rPr>
-          <w:sz w:val="28"/>
-          <w:szCs w:val="28"/>
-        </w:rPr>
-      </w:pPr>
-    </w:p>
-    <w:p>
-      <w:pPr>
-        <w:pStyle w:val="BodyText"/>
-        <w:ind w:left="720"/>
-        <w:rPr>
-          <w:sz w:val="28"/>
-          <w:szCs w:val="28"/>
-        </w:rPr>
-      </w:pPr>
-      <w:r>
-        <w:rPr>
-          <w:sz w:val="28"/>
-          <w:szCs w:val="28"/>
-        </w:rPr>
-        <w:t>2. Intelligent Route Planning: Implement advanced routing engines (like Mapbox or Google Directions API) to allow users to plan long road trips, with the system automatically suggesting optimal charging stops based on their specific EV's battery range.</w:t>
-      </w:r>
-    </w:p>
-    <w:p>
-      <w:pPr>
-        <w:pStyle w:val="BodyText"/>
-        <w:ind w:left="720"/>
-        <w:rPr>
-          <w:sz w:val="28"/>
-          <w:szCs w:val="28"/>
-        </w:rPr>
-      </w:pPr>
-    </w:p>
-    <w:p>
-      <w:pPr>
-        <w:pStyle w:val="BodyText"/>
-        <w:ind w:left="720"/>
-        <w:rPr>
-          <w:sz w:val="28"/>
-          <w:szCs w:val="28"/>
-        </w:rPr>
-      </w:pPr>
-      <w:r>
-        <w:rPr>
-          <w:sz w:val="28"/>
-          <w:szCs w:val="28"/>
-        </w:rPr>
-        <w:t>3. In-App Payment Gateway: Integrate payment processors like Stripe or Razorpay to allow users to securely reserve charging slots and pay for their charging sessions directly within the ElectroMap application.</w:t>
-      </w:r>
-    </w:p>
-    <w:p>
-      <w:pPr>
-        <w:pStyle w:val="BodyText"/>
-        <w:ind w:left="720"/>
-        <w:rPr>
-          <w:sz w:val="28"/>
-          <w:szCs w:val="28"/>
-        </w:rPr>
-      </w:pPr>
-    </w:p>
-    <w:p>
-      <w:pPr>
-        <w:pStyle w:val="BodyText"/>
-        <w:ind w:left="720"/>
-        <w:rPr>
-          <w:sz w:val="28"/>
-          <w:szCs w:val="28"/>
-        </w:rPr>
-      </w:pPr>
-      <w:r>
-        <w:rPr>
-          <w:sz w:val="28"/>
-          <w:szCs w:val="28"/>
-        </w:rPr>
-        <w:t>4. User Reviews &amp; Ratings: Allow drivers to leave star ratings, written reviews, and upload photos for charging stations. This crowdsourced feedback helps the community identify broken, blocked, or highly reliable chargers.</w:t>
-      </w:r>
-    </w:p>
-    <w:p>
-      <w:pPr>
-        <w:pStyle w:val="BodyText"/>
-        <w:ind w:left="720"/>
-        <w:rPr>
-          <w:sz w:val="28"/>
-          <w:szCs w:val="28"/>
-        </w:rPr>
-      </w:pPr>
-    </w:p>
-    <w:p>
-      <w:pPr>
-        <w:pStyle w:val="BodyText"/>
-        <w:ind w:left="720"/>
-        <w:rPr>
-          <w:sz w:val="28"/>
-          <w:szCs w:val="28"/>
-        </w:rPr>
-      </w:pPr>
-      <w:r>
-        <w:rPr>
-          <w:sz w:val="28"/>
-          <w:szCs w:val="28"/>
-        </w:rPr>
-        <w:t>5. Vehicle Profile Filtering: Enable users to save their specific EV make and model in their profile. The application can then automatically filter the map to only show stations with compatible connector types (e.g., CCS2, CHAdeMO) and optimal charging speeds.</w:t>
-      </w:r>
-    </w:p>
-    <w:p>
-      <w:pPr>
-        <w:pStyle w:val="BodyText"/>
-        <w:ind w:left="720"/>
-        <w:rPr>
-          <w:sz w:val="28"/>
-          <w:szCs w:val="28"/>
-        </w:rPr>
-      </w:pPr>
-    </w:p>
-    <w:p>
-      <w:pPr>
-        <w:pStyle w:val="BodyText"/>
-        <w:ind w:left="720"/>
-        <w:rPr>
-          <w:sz w:val="28"/>
-          <w:szCs w:val="28"/>
-        </w:rPr>
-      </w:pPr>
-      <w:r>
-        <w:rPr>
-          <w:sz w:val="28"/>
-          <w:szCs w:val="28"/>
-        </w:rPr>
-        <w:t>6. Push Notifications &amp; Alerts: Implement browser or mobile push notifications to alert users when a highly contested nearby station becomes available, or when their ongoing charging session reaches 100%.</w:t>
-      </w:r>
-    </w:p>
-    <w:p>
-      <w:pPr>
-        <w:pStyle w:val="BodyText"/>
-        <w:ind w:left="720"/>
-        <w:rPr>
-          <w:sz w:val="28"/>
-          <w:szCs w:val="28"/>
-        </w:rPr>
-      </w:pPr>
-    </w:p>
-    <w:p>
-      <w:pPr>
-        <w:pStyle w:val="BodyText"/>
-        <w:ind w:left="720"/>
-        <w:rPr>
-          <w:sz w:val="28"/>
-          <w:szCs w:val="28"/>
-        </w:rPr>
-      </w:pPr>
-      <w:r>
-        <w:rPr>
-          <w:sz w:val="28"/>
-          <w:szCs w:val="28"/>
-        </w:rPr>
-        <w:t>7. Advanced Admin Analytics Dashboard: Upgrade the admin panel with visual data representations (using Chart.js or Recharts) showing peak charging hours, the most utilized geographic zones, and user growth trends.</w:t>
-      </w:r>
-    </w:p>
-    <w:p>
-      <w:pPr>
-        <w:pStyle w:val="BodyText"/>
-        <w:ind w:left="720"/>
-        <w:rPr>
-          <w:sz w:val="28"/>
-          <w:szCs w:val="28"/>
-        </w:rPr>
-      </w:pPr>
-    </w:p>
-    <w:p>
-      <w:pPr>
-        <w:pStyle w:val="BodyText"/>
-        <w:ind w:left="720"/>
-        <w:rPr>
-          <w:sz w:val="28"/>
-          <w:szCs w:val="28"/>
-        </w:rPr>
-      </w:pPr>
-      <w:r>
-        <w:rPr>
-          <w:sz w:val="28"/>
-          <w:szCs w:val="28"/>
-        </w:rPr>
-        <w:t>8. Favorite &amp; Saved Stations: Introduce a feature allowing users to bookmark or "favorite" their most frequently visited charging stations for quick access directly from their profile dashboard.</w:t>
-      </w:r>
-    </w:p>
-    <w:p>
-      <w:pPr>
-        <w:pStyle w:val="BodyText"/>
-        <w:ind w:left="720"/>
-        <w:rPr>
-          <w:sz w:val="28"/>
-          <w:szCs w:val="28"/>
-        </w:rPr>
-      </w:pPr>
-    </w:p>
-    <w:p>
-      <w:pPr>
-        <w:pStyle w:val="BodyText"/>
-        <w:ind w:left="720"/>
-        <w:rPr>
-          <w:sz w:val="28"/>
-          <w:szCs w:val="28"/>
-        </w:rPr>
-      </w:pPr>
-      <w:r>
-        <w:rPr>
-          <w:sz w:val="28"/>
-          <w:szCs w:val="28"/>
-        </w:rPr>
-        <w:t>9. Crowdsourced Station Reporting: Allow active users to submit new, undocumented charging stations or flag inaccurate data (e.g., incorrect pricing or closed stations), creating a moderation queue for admins to review and approve.</w:t>
-      </w:r>
-    </w:p>
-    <w:p>
-      <w:pPr>
-        <w:pStyle w:val="BodyText"/>
-        <w:ind w:left="720"/>
-        <w:rPr>
-          <w:sz w:val="28"/>
-          <w:szCs w:val="28"/>
-        </w:rPr>
-      </w:pPr>
-    </w:p>
-    <w:p>
-      <w:pPr>
-        <w:pStyle w:val="BodyText"/>
-        <w:ind w:left="720"/>
-        <w:rPr>
-          <w:sz w:val="28"/>
-          <w:szCs w:val="28"/>
-        </w:rPr>
-      </w:pPr>
-      <w:r>
-        <w:rPr>
-          <w:sz w:val="28"/>
-          <w:szCs w:val="28"/>
-        </w:rPr>
-        <w:t>10.</w:t>
-      </w:r>
-      <w:r>
-        <w:rPr>
-          <w:sz w:val="28"/>
-          <w:szCs w:val="28"/>
-        </w:rPr>
-        <w:t xml:space="preserve"> </w:t>
-      </w:r>
-      <w:r>
-        <w:rPr>
-          <w:sz w:val="28"/>
-          <w:szCs w:val="28"/>
-        </w:rPr>
-        <w:t>Native Navigation Hand-off: Add a "Get Directions" feature that seamlessly exports the selected charging station's precise geospatial coordinates into the user's native Google Maps, Apple Maps, or Waze application for turn-by-turn navigation.</w:t>
-      </w:r>
-    </w:p>
-    <w:p>
-      <w:pPr>
-        <w:rPr>
-          <w:spacing w:val="-2"/>
-          <w:sz w:val="24"/>
-          <w:szCs w:val="24"/>
-        </w:rPr>
-      </w:pPr>
-      <w:r>
-        <w:rPr>
-          <w:spacing w:val="-2"/>
-          <w:sz w:val="24"/>
-          <w:szCs w:val="24"/>
-        </w:rPr>
-        <w:br w:type="page"/>
-      </w:r>
-    </w:p>
-    <w:p>
-      <w:pPr>
-        <w:pStyle w:val="Heading2"/>
-        <w:numPr>
-          <w:ilvl w:val="0"/>
-          <w:numId w:val="12"/>
-        </w:numPr>
-        <w:tabs>
-          <w:tab w:val="left" w:pos="1209"/>
-        </w:tabs>
-        <w:spacing w:before="65"/>
-        <w:ind w:left="1209" w:hanging="477"/>
       </w:pPr>
       <w:r>
         <w:rPr>
@@ -15588,6 +15543,95 @@
     </w:lvl>
   </w:abstractNum>
   <w:abstractNum w:abstractNumId="16" w15:restartNumberingAfterBreak="0">
+    <w:nsid w:val="4831509C"/>
+    <w:multiLevelType w:val="hybridMultilevel"/>
+    <w:tmpl w:val="13C27BF6"/>
+    <w:lvl w:ilvl="0" w:tplc="6F6E442E">
+      <w:start w:val="12"/>
+      <w:numFmt w:val="decimal"/>
+      <w:lvlText w:val="%1."/>
+      <w:lvlJc w:val="left"/>
+      <w:pPr>
+        <w:ind w:left="780" w:hanging="420"/>
+      </w:pPr>
+      <w:rPr>
+        <w:rFonts w:hint="default"/>
+      </w:rPr>
+    </w:lvl>
+    <w:lvl w:ilvl="1" w:tplc="40090019" w:tentative="1">
+      <w:start w:val="1"/>
+      <w:numFmt w:val="lowerLetter"/>
+      <w:lvlText w:val="%2."/>
+      <w:lvlJc w:val="left"/>
+      <w:pPr>
+        <w:ind w:left="1440" w:hanging="360"/>
+      </w:pPr>
+    </w:lvl>
+    <w:lvl w:ilvl="2" w:tplc="4009001B" w:tentative="1">
+      <w:start w:val="1"/>
+      <w:numFmt w:val="lowerRoman"/>
+      <w:lvlText w:val="%3."/>
+      <w:lvlJc w:val="right"/>
+      <w:pPr>
+        <w:ind w:left="2160" w:hanging="180"/>
+      </w:pPr>
+    </w:lvl>
+    <w:lvl w:ilvl="3" w:tplc="4009000F" w:tentative="1">
+      <w:start w:val="1"/>
+      <w:numFmt w:val="decimal"/>
+      <w:lvlText w:val="%4."/>
+      <w:lvlJc w:val="left"/>
+      <w:pPr>
+        <w:ind w:left="2880" w:hanging="360"/>
+      </w:pPr>
+    </w:lvl>
+    <w:lvl w:ilvl="4" w:tplc="40090019" w:tentative="1">
+      <w:start w:val="1"/>
+      <w:numFmt w:val="lowerLetter"/>
+      <w:lvlText w:val="%5."/>
+      <w:lvlJc w:val="left"/>
+      <w:pPr>
+        <w:ind w:left="3600" w:hanging="360"/>
+      </w:pPr>
+    </w:lvl>
+    <w:lvl w:ilvl="5" w:tplc="4009001B" w:tentative="1">
+      <w:start w:val="1"/>
+      <w:numFmt w:val="lowerRoman"/>
+      <w:lvlText w:val="%6."/>
+      <w:lvlJc w:val="right"/>
+      <w:pPr>
+        <w:ind w:left="4320" w:hanging="180"/>
+      </w:pPr>
+    </w:lvl>
+    <w:lvl w:ilvl="6" w:tplc="4009000F" w:tentative="1">
+      <w:start w:val="1"/>
+      <w:numFmt w:val="decimal"/>
+      <w:lvlText w:val="%7."/>
+      <w:lvlJc w:val="left"/>
+      <w:pPr>
+        <w:ind w:left="5040" w:hanging="360"/>
+      </w:pPr>
+    </w:lvl>
+    <w:lvl w:ilvl="7" w:tplc="40090019" w:tentative="1">
+      <w:start w:val="1"/>
+      <w:numFmt w:val="lowerLetter"/>
+      <w:lvlText w:val="%8."/>
+      <w:lvlJc w:val="left"/>
+      <w:pPr>
+        <w:ind w:left="5760" w:hanging="360"/>
+      </w:pPr>
+    </w:lvl>
+    <w:lvl w:ilvl="8" w:tplc="4009001B" w:tentative="1">
+      <w:start w:val="1"/>
+      <w:numFmt w:val="lowerRoman"/>
+      <w:lvlText w:val="%9."/>
+      <w:lvlJc w:val="right"/>
+      <w:pPr>
+        <w:ind w:left="6480" w:hanging="180"/>
+      </w:pPr>
+    </w:lvl>
+  </w:abstractNum>
+  <w:abstractNum w:abstractNumId="17" w15:restartNumberingAfterBreak="0">
     <w:nsid w:val="4C1D3152"/>
     <w:multiLevelType w:val="hybridMultilevel"/>
     <w:tmpl w:val="C1348C56"/>
@@ -15708,7 +15752,7 @@
       </w:rPr>
     </w:lvl>
   </w:abstractNum>
-  <w:abstractNum w:abstractNumId="17" w15:restartNumberingAfterBreak="0">
+  <w:abstractNum w:abstractNumId="18" w15:restartNumberingAfterBreak="0">
     <w:nsid w:val="543257A2"/>
     <w:multiLevelType w:val="hybridMultilevel"/>
     <w:tmpl w:val="F34C29F6"/>
@@ -15797,7 +15841,7 @@
       </w:pPr>
     </w:lvl>
   </w:abstractNum>
-  <w:abstractNum w:abstractNumId="18" w15:restartNumberingAfterBreak="0">
+  <w:abstractNum w:abstractNumId="19" w15:restartNumberingAfterBreak="0">
     <w:nsid w:val="5AA35F0D"/>
     <w:multiLevelType w:val="hybridMultilevel"/>
     <w:tmpl w:val="9D5EC8AA"/>
@@ -15918,7 +15962,97 @@
       </w:rPr>
     </w:lvl>
   </w:abstractNum>
-  <w:abstractNum w:abstractNumId="19" w15:restartNumberingAfterBreak="0">
+  <w:abstractNum w:abstractNumId="20" w15:restartNumberingAfterBreak="0">
+    <w:nsid w:val="5F6629D8"/>
+    <w:multiLevelType w:val="hybridMultilevel"/>
+    <w:tmpl w:val="723E51F2"/>
+    <w:lvl w:ilvl="0" w:tplc="FEEAF9DE">
+      <w:start w:val="12"/>
+      <w:numFmt w:val="decimal"/>
+      <w:lvlText w:val="%1."/>
+      <w:lvlJc w:val="left"/>
+      <w:pPr>
+        <w:ind w:left="1140" w:hanging="420"/>
+      </w:pPr>
+      <w:rPr>
+        <w:rFonts w:hint="default"/>
+        <w:sz w:val="32"/>
+      </w:rPr>
+    </w:lvl>
+    <w:lvl w:ilvl="1" w:tplc="40090019" w:tentative="1">
+      <w:start w:val="1"/>
+      <w:numFmt w:val="lowerLetter"/>
+      <w:lvlText w:val="%2."/>
+      <w:lvlJc w:val="left"/>
+      <w:pPr>
+        <w:ind w:left="1800" w:hanging="360"/>
+      </w:pPr>
+    </w:lvl>
+    <w:lvl w:ilvl="2" w:tplc="4009001B" w:tentative="1">
+      <w:start w:val="1"/>
+      <w:numFmt w:val="lowerRoman"/>
+      <w:lvlText w:val="%3."/>
+      <w:lvlJc w:val="right"/>
+      <w:pPr>
+        <w:ind w:left="2520" w:hanging="180"/>
+      </w:pPr>
+    </w:lvl>
+    <w:lvl w:ilvl="3" w:tplc="4009000F" w:tentative="1">
+      <w:start w:val="1"/>
+      <w:numFmt w:val="decimal"/>
+      <w:lvlText w:val="%4."/>
+      <w:lvlJc w:val="left"/>
+      <w:pPr>
+        <w:ind w:left="3240" w:hanging="360"/>
+      </w:pPr>
+    </w:lvl>
+    <w:lvl w:ilvl="4" w:tplc="40090019" w:tentative="1">
+      <w:start w:val="1"/>
+      <w:numFmt w:val="lowerLetter"/>
+      <w:lvlText w:val="%5."/>
+      <w:lvlJc w:val="left"/>
+      <w:pPr>
+        <w:ind w:left="3960" w:hanging="360"/>
+      </w:pPr>
+    </w:lvl>
+    <w:lvl w:ilvl="5" w:tplc="4009001B" w:tentative="1">
+      <w:start w:val="1"/>
+      <w:numFmt w:val="lowerRoman"/>
+      <w:lvlText w:val="%6."/>
+      <w:lvlJc w:val="right"/>
+      <w:pPr>
+        <w:ind w:left="4680" w:hanging="180"/>
+      </w:pPr>
+    </w:lvl>
+    <w:lvl w:ilvl="6" w:tplc="4009000F" w:tentative="1">
+      <w:start w:val="1"/>
+      <w:numFmt w:val="decimal"/>
+      <w:lvlText w:val="%7."/>
+      <w:lvlJc w:val="left"/>
+      <w:pPr>
+        <w:ind w:left="5400" w:hanging="360"/>
+      </w:pPr>
+    </w:lvl>
+    <w:lvl w:ilvl="7" w:tplc="40090019" w:tentative="1">
+      <w:start w:val="1"/>
+      <w:numFmt w:val="lowerLetter"/>
+      <w:lvlText w:val="%8."/>
+      <w:lvlJc w:val="left"/>
+      <w:pPr>
+        <w:ind w:left="6120" w:hanging="360"/>
+      </w:pPr>
+    </w:lvl>
+    <w:lvl w:ilvl="8" w:tplc="4009001B" w:tentative="1">
+      <w:start w:val="1"/>
+      <w:numFmt w:val="lowerRoman"/>
+      <w:lvlText w:val="%9."/>
+      <w:lvlJc w:val="right"/>
+      <w:pPr>
+        <w:ind w:left="6840" w:hanging="180"/>
+      </w:pPr>
+    </w:lvl>
+  </w:abstractNum>
+  <w:abstractNum w:abstractNumId="21" w15:restartNumberingAfterBreak="0">
     <w:nsid w:val="69EC574A"/>
     <w:multiLevelType w:val="hybridMultilevel"/>
     <w:tmpl w:val="DFA2C63E"/>
@@ -16041,7 +16175,7 @@
       </w:rPr>
     </w:lvl>
   </w:abstractNum>
-  <w:abstractNum w:abstractNumId="20" w15:restartNumberingAfterBreak="0">
+  <w:abstractNum w:abstractNumId="22" w15:restartNumberingAfterBreak="0">
     <w:nsid w:val="6F8C2E41"/>
     <w:multiLevelType w:val="hybridMultilevel"/>
     <w:tmpl w:val="589E049C"/>
@@ -16156,10 +16290,10 @@
       </w:rPr>
     </w:lvl>
   </w:abstractNum>
-  <w:abstractNum w:abstractNumId="21" w15:restartNumberingAfterBreak="0">
+  <w:abstractNum w:abstractNumId="23" w15:restartNumberingAfterBreak="0">
     <w:nsid w:val="73D46C9E"/>
     <w:multiLevelType w:val="multilevel"/>
-    <w:tmpl w:val="7068C3D8"/>
+    <w:tmpl w:val="09346AD2"/>
     <w:lvl w:ilvl="0">
       <w:start w:val="1"/>
       <w:numFmt w:val="decimal"/>
@@ -16172,17 +16306,17 @@
         <w:ind w:left="720" w:hanging="360"/>
       </w:pPr>
     </w:lvl>
-    <w:lvl w:ilvl="1" w:tentative="1">
-      <w:start w:val="1"/>
+    <w:lvl w:ilvl="1">
+      <w:start w:val="15"/>
       <w:numFmt w:val="decimal"/>
       <w:lvlText w:val="%2."/>
       <w:lvlJc w:val="left"/>
       <w:pPr>
-        <w:tabs>
-          <w:tab w:val="num" w:pos="1440"/>
-        </w:tabs>
-        <w:ind w:left="1440" w:hanging="360"/>
-      </w:pPr>
+        <w:ind w:left="1500" w:hanging="420"/>
+      </w:pPr>
+      <w:rPr>
+        <w:rFonts w:hint="default"/>
+      </w:rPr>
     </w:lvl>
     <w:lvl w:ilvl="2" w:tentative="1">
       <w:start w:val="1"/>
@@ -16269,7 +16403,7 @@
       </w:pPr>
     </w:lvl>
   </w:abstractNum>
-  <w:abstractNum w:abstractNumId="22" w15:restartNumberingAfterBreak="0">
+  <w:abstractNum w:abstractNumId="24" w15:restartNumberingAfterBreak="0">
     <w:nsid w:val="7DA21570"/>
     <w:multiLevelType w:val="hybridMultilevel"/>
     <w:tmpl w:val="322C39BC"/>
@@ -16394,7 +16528,7 @@
     <w:abstractNumId w:val="8"/>
   </w:num>
   <w:num w:numId="2" w16cid:durableId="493760901">
-    <w:abstractNumId w:val="22"/>
+    <w:abstractNumId w:val="24"/>
   </w:num>
   <w:num w:numId="3" w16cid:durableId="1781297167">
     <w:abstractNumId w:val="13"/>
@@ -16406,19 +16540,19 @@
     <w:abstractNumId w:val="6"/>
   </w:num>
   <w:num w:numId="6" w16cid:durableId="209221414">
-    <w:abstractNumId w:val="16"/>
+    <w:abstractNumId w:val="17"/>
   </w:num>
   <w:num w:numId="7" w16cid:durableId="1214343061">
     <w:abstractNumId w:val="5"/>
   </w:num>
   <w:num w:numId="8" w16cid:durableId="335769611">
-    <w:abstractNumId w:val="18"/>
+    <w:abstractNumId w:val="19"/>
   </w:num>
   <w:num w:numId="9" w16cid:durableId="1944610414">
     <w:abstractNumId w:val="10"/>
   </w:num>
   <w:num w:numId="10" w16cid:durableId="1219782849">
-    <w:abstractNumId w:val="19"/>
+    <w:abstractNumId w:val="21"/>
   </w:num>
   <w:num w:numId="11" w16cid:durableId="1313366242">
     <w:abstractNumId w:val="3"/>
@@ -16430,7 +16564,7 @@
     <w:abstractNumId w:val="0"/>
   </w:num>
   <w:num w:numId="14" w16cid:durableId="1329554789">
-    <w:abstractNumId w:val="17"/>
+    <w:abstractNumId w:val="18"/>
   </w:num>
   <w:num w:numId="15" w16cid:durableId="1088383020">
     <w:abstractNumId w:val="12"/>
@@ -16445,7 +16579,7 @@
     <w:abstractNumId w:val="9"/>
   </w:num>
   <w:num w:numId="19" w16cid:durableId="248321010">
-    <w:abstractNumId w:val="20"/>
+    <w:abstractNumId w:val="22"/>
   </w:num>
   <w:num w:numId="20" w16cid:durableId="943342640">
     <w:abstractNumId w:val="7"/>
@@ -16454,10 +16588,16 @@
     <w:abstractNumId w:val="4"/>
   </w:num>
   <w:num w:numId="22" w16cid:durableId="1405835456">
-    <w:abstractNumId w:val="21"/>
+    <w:abstractNumId w:val="23"/>
   </w:num>
   <w:num w:numId="23" w16cid:durableId="614554447">
     <w:abstractNumId w:val="14"/>
+  </w:num>
+  <w:num w:numId="24" w16cid:durableId="1003438887">
+    <w:abstractNumId w:val="20"/>
+  </w:num>
+  <w:num w:numId="25" w16cid:durableId="1348754609">
+    <w:abstractNumId w:val="16"/>
   </w:num>
 </w:numbering>
 </file>

</xml_diff>